<commit_message>
Update file Mo ta RDM
</commit_message>
<xml_diff>
--- a/Diagrams/RDM/Mo_ta_CSDL_SoundWave.docx
+++ b/Diagrams/RDM/Mo_ta_CSDL_SoundWave.docx
@@ -20,8 +20,6 @@
         </w:rPr>
         <w:t>CÁC BẢNG</w:t>
       </w:r>
-      <w:bookmarkStart w:id="0" w:name="_GoBack"/>
-      <w:bookmarkEnd w:id="0"/>
     </w:p>
     <w:p>
       <w:pPr>
@@ -744,6 +742,14 @@
         </w:tc>
       </w:tr>
       <w:tr>
+        <w:tblPrEx>
+          <w:tblCellMar>
+            <w:top w:w="0" w:type="dxa"/>
+            <w:left w:w="108" w:type="dxa"/>
+            <w:bottom w:w="0" w:type="dxa"/>
+            <w:right w:w="108" w:type="dxa"/>
+          </w:tblCellMar>
+        </w:tblPrEx>
         <w:tc>
           <w:tcPr>
             <w:tcW w:w="2880" w:type="dxa"/>
@@ -776,6 +782,14 @@
         </w:tc>
       </w:tr>
       <w:tr>
+        <w:tblPrEx>
+          <w:tblCellMar>
+            <w:top w:w="0" w:type="dxa"/>
+            <w:left w:w="108" w:type="dxa"/>
+            <w:bottom w:w="0" w:type="dxa"/>
+            <w:right w:w="108" w:type="dxa"/>
+          </w:tblCellMar>
+        </w:tblPrEx>
         <w:tc>
           <w:tcPr>
             <w:tcW w:w="2880" w:type="dxa"/>
@@ -1275,6 +1289,14 @@
         </w:tc>
       </w:tr>
       <w:tr>
+        <w:tblPrEx>
+          <w:tblCellMar>
+            <w:top w:w="0" w:type="dxa"/>
+            <w:left w:w="108" w:type="dxa"/>
+            <w:bottom w:w="0" w:type="dxa"/>
+            <w:right w:w="108" w:type="dxa"/>
+          </w:tblCellMar>
+        </w:tblPrEx>
         <w:tc>
           <w:tcPr>
             <w:tcW w:w="2880" w:type="dxa"/>
@@ -1574,6 +1596,14 @@
         <w:gridCol w:w="2880"/>
       </w:tblGrid>
       <w:tr>
+        <w:tblPrEx>
+          <w:tblCellMar>
+            <w:top w:w="0" w:type="dxa"/>
+            <w:left w:w="108" w:type="dxa"/>
+            <w:bottom w:w="0" w:type="dxa"/>
+            <w:right w:w="108" w:type="dxa"/>
+          </w:tblCellMar>
+        </w:tblPrEx>
         <w:tc>
           <w:tcPr>
             <w:tcW w:w="2880" w:type="dxa"/>
@@ -1771,7 +1801,12 @@
         <w:pStyle w:val="3"/>
       </w:pPr>
       <w:r>
-        <w:t>Bảng SongLike</w:t>
+        <w:t xml:space="preserve">Bảng </w:t>
+      </w:r>
+      <w:bookmarkStart w:id="0" w:name="_GoBack"/>
+      <w:bookmarkEnd w:id="0"/>
+      <w:r>
+        <w:t>Like</w:t>
       </w:r>
     </w:p>
     <w:tbl>
@@ -2941,14 +2976,6 @@
         </w:tc>
       </w:tr>
       <w:tr>
-        <w:tblPrEx>
-          <w:tblCellMar>
-            <w:top w:w="0" w:type="dxa"/>
-            <w:left w:w="108" w:type="dxa"/>
-            <w:bottom w:w="0" w:type="dxa"/>
-            <w:right w:w="108" w:type="dxa"/>
-          </w:tblCellMar>
-        </w:tblPrEx>
         <w:tc>
           <w:tcPr>
             <w:tcW w:w="2880" w:type="dxa"/>
@@ -3328,14 +3355,6 @@
         </w:tc>
       </w:tr>
       <w:tr>
-        <w:tblPrEx>
-          <w:tblCellMar>
-            <w:top w:w="0" w:type="dxa"/>
-            <w:left w:w="108" w:type="dxa"/>
-            <w:bottom w:w="0" w:type="dxa"/>
-            <w:right w:w="108" w:type="dxa"/>
-          </w:tblCellMar>
-        </w:tblPrEx>
         <w:tc>
           <w:tcPr>
             <w:tcW w:w="2880" w:type="dxa"/>
@@ -3395,6 +3414,14 @@
         <w:gridCol w:w="2880"/>
       </w:tblGrid>
       <w:tr>
+        <w:tblPrEx>
+          <w:tblCellMar>
+            <w:top w:w="0" w:type="dxa"/>
+            <w:left w:w="108" w:type="dxa"/>
+            <w:bottom w:w="0" w:type="dxa"/>
+            <w:right w:w="108" w:type="dxa"/>
+          </w:tblCellMar>
+        </w:tblPrEx>
         <w:tc>
           <w:tcPr>
             <w:tcW w:w="2880" w:type="dxa"/>
@@ -3422,38 +3449,6 @@
           <w:p>
             <w:r>
               <w:t>Ý nghĩa</w:t>
-            </w:r>
-          </w:p>
-        </w:tc>
-      </w:tr>
-      <w:tr>
-        <w:tc>
-          <w:tcPr>
-            <w:tcW w:w="2880" w:type="dxa"/>
-          </w:tcPr>
-          <w:p>
-            <w:r>
-              <w:t>id</w:t>
-            </w:r>
-          </w:p>
-        </w:tc>
-        <w:tc>
-          <w:tcPr>
-            <w:tcW w:w="2880" w:type="dxa"/>
-          </w:tcPr>
-          <w:p>
-            <w:r>
-              <w:t>VARCHAR(50)</w:t>
-            </w:r>
-          </w:p>
-        </w:tc>
-        <w:tc>
-          <w:tcPr>
-            <w:tcW w:w="2880" w:type="dxa"/>
-          </w:tcPr>
-          <w:p>
-            <w:r>
-              <w:t>Khóa chính</w:t>
             </w:r>
           </w:p>
         </w:tc>
@@ -3473,32 +3468,80 @@
           </w:tcPr>
           <w:p>
             <w:r>
-              <w:t>content</w:t>
-            </w:r>
-          </w:p>
-        </w:tc>
-        <w:tc>
-          <w:tcPr>
-            <w:tcW w:w="2880" w:type="dxa"/>
-          </w:tcPr>
-          <w:p>
-            <w:r>
-              <w:t>TEXT</w:t>
-            </w:r>
-          </w:p>
-        </w:tc>
-        <w:tc>
-          <w:tcPr>
-            <w:tcW w:w="2880" w:type="dxa"/>
-          </w:tcPr>
-          <w:p>
-            <w:r>
-              <w:t>Nội dung thông báo</w:t>
+              <w:t>id</w:t>
+            </w:r>
+          </w:p>
+        </w:tc>
+        <w:tc>
+          <w:tcPr>
+            <w:tcW w:w="2880" w:type="dxa"/>
+          </w:tcPr>
+          <w:p>
+            <w:r>
+              <w:t>VARCHAR(50)</w:t>
+            </w:r>
+          </w:p>
+        </w:tc>
+        <w:tc>
+          <w:tcPr>
+            <w:tcW w:w="2880" w:type="dxa"/>
+          </w:tcPr>
+          <w:p>
+            <w:r>
+              <w:t>Khóa chính</w:t>
             </w:r>
           </w:p>
         </w:tc>
       </w:tr>
       <w:tr>
+        <w:tblPrEx>
+          <w:tblCellMar>
+            <w:top w:w="0" w:type="dxa"/>
+            <w:left w:w="108" w:type="dxa"/>
+            <w:bottom w:w="0" w:type="dxa"/>
+            <w:right w:w="108" w:type="dxa"/>
+          </w:tblCellMar>
+        </w:tblPrEx>
+        <w:tc>
+          <w:tcPr>
+            <w:tcW w:w="2880" w:type="dxa"/>
+          </w:tcPr>
+          <w:p>
+            <w:r>
+              <w:t>content</w:t>
+            </w:r>
+          </w:p>
+        </w:tc>
+        <w:tc>
+          <w:tcPr>
+            <w:tcW w:w="2880" w:type="dxa"/>
+          </w:tcPr>
+          <w:p>
+            <w:r>
+              <w:t>TEXT</w:t>
+            </w:r>
+          </w:p>
+        </w:tc>
+        <w:tc>
+          <w:tcPr>
+            <w:tcW w:w="2880" w:type="dxa"/>
+          </w:tcPr>
+          <w:p>
+            <w:r>
+              <w:t>Nội dung thông báo</w:t>
+            </w:r>
+          </w:p>
+        </w:tc>
+      </w:tr>
+      <w:tr>
+        <w:tblPrEx>
+          <w:tblCellMar>
+            <w:top w:w="0" w:type="dxa"/>
+            <w:left w:w="108" w:type="dxa"/>
+            <w:bottom w:w="0" w:type="dxa"/>
+            <w:right w:w="108" w:type="dxa"/>
+          </w:tblCellMar>
+        </w:tblPrEx>
         <w:tc>
           <w:tcPr>
             <w:tcW w:w="2880" w:type="dxa"/>
@@ -3638,38 +3681,6 @@
         <w:gridCol w:w="2880"/>
       </w:tblGrid>
       <w:tr>
-        <w:tc>
-          <w:tcPr>
-            <w:tcW w:w="2880" w:type="dxa"/>
-          </w:tcPr>
-          <w:p>
-            <w:r>
-              <w:t>Tên cột</w:t>
-            </w:r>
-          </w:p>
-        </w:tc>
-        <w:tc>
-          <w:tcPr>
-            <w:tcW w:w="2880" w:type="dxa"/>
-          </w:tcPr>
-          <w:p>
-            <w:r>
-              <w:t xml:space="preserve">Kiểu dữ liệu </w:t>
-            </w:r>
-          </w:p>
-        </w:tc>
-        <w:tc>
-          <w:tcPr>
-            <w:tcW w:w="2880" w:type="dxa"/>
-          </w:tcPr>
-          <w:p>
-            <w:r>
-              <w:t>Ý nghĩa</w:t>
-            </w:r>
-          </w:p>
-        </w:tc>
-      </w:tr>
-      <w:tr>
         <w:tblPrEx>
           <w:tblCellMar>
             <w:top w:w="0" w:type="dxa"/>
@@ -3678,6 +3689,38 @@
             <w:right w:w="108" w:type="dxa"/>
           </w:tblCellMar>
         </w:tblPrEx>
+        <w:tc>
+          <w:tcPr>
+            <w:tcW w:w="2880" w:type="dxa"/>
+          </w:tcPr>
+          <w:p>
+            <w:r>
+              <w:t>Tên cột</w:t>
+            </w:r>
+          </w:p>
+        </w:tc>
+        <w:tc>
+          <w:tcPr>
+            <w:tcW w:w="2880" w:type="dxa"/>
+          </w:tcPr>
+          <w:p>
+            <w:r>
+              <w:t xml:space="preserve">Kiểu dữ liệu </w:t>
+            </w:r>
+          </w:p>
+        </w:tc>
+        <w:tc>
+          <w:tcPr>
+            <w:tcW w:w="2880" w:type="dxa"/>
+          </w:tcPr>
+          <w:p>
+            <w:r>
+              <w:t>Ý nghĩa</w:t>
+            </w:r>
+          </w:p>
+        </w:tc>
+      </w:tr>
+      <w:tr>
         <w:tc>
           <w:tcPr>
             <w:tcW w:w="2880" w:type="dxa"/>

</xml_diff>